<commit_message>
Rinumerazione risorse 1-19 in ordine di apparizione nel libro
- 15 file risorsa rinominati per allinearsi alla nuova numerazione sequenziale
- index.html (landing): etichette Risorsa aggiornate
- 00_INDICE_Risorse (docx+pdf): rigenerato e riordinato 01->19
- Allineato a libro PDF (19 QR) ed email Brevo #36

Co-Authored-By: Claude Opus 4.8 (1M context) <noreply@anthropic.com>
</commit_message>
<xml_diff>
--- a/risorse/00_INDICE_Risorse.docx
+++ b/risorse/00_INDICE_Risorse.docx
@@ -177,7 +177,7 @@
               <w:pStyle w:val="Compact"/>
             </w:pPr>
             <w:r>
-              <w:t xml:space="preserve">01</w:t>
+              <w:t>01</w:t>
             </w:r>
           </w:p>
         </w:tc>
@@ -188,7 +188,7 @@
               <w:pStyle w:val="Compact"/>
             </w:pPr>
             <w:r>
-              <w:t xml:space="preserve">Diagnosi: dove l’AI ti fa risparmiare più tempo</w:t>
+              <w:t>Diagnosi: dove l’AI ti fa risparmiare più tempo</w:t>
             </w:r>
           </w:p>
         </w:tc>
@@ -199,7 +199,7 @@
               <w:pStyle w:val="Compact"/>
             </w:pPr>
             <w:r>
-              <w:t xml:space="preserve">PDF · DOCX</w:t>
+              <w:t>PDF · DOCX</w:t>
             </w:r>
           </w:p>
         </w:tc>
@@ -210,7 +210,7 @@
               <w:pStyle w:val="Compact"/>
             </w:pPr>
             <w:r>
-              <w:t xml:space="preserve">Cap. 1</w:t>
+              <w:t>Cap. 1</w:t>
             </w:r>
           </w:p>
         </w:tc>
@@ -223,7 +223,7 @@
               <w:pStyle w:val="Compact"/>
             </w:pPr>
             <w:r>
-              <w:t xml:space="preserve">02</w:t>
+              <w:t>02</w:t>
             </w:r>
           </w:p>
         </w:tc>
@@ -234,7 +234,7 @@
               <w:pStyle w:val="Compact"/>
             </w:pPr>
             <w:r>
-              <w:t xml:space="preserve">Libreria 50 Prompt per chi lavora</w:t>
+              <w:t>Libreria 50 Prompt per chi lavora</w:t>
             </w:r>
           </w:p>
         </w:tc>
@@ -245,7 +245,7 @@
               <w:pStyle w:val="Compact"/>
             </w:pPr>
             <w:r>
-              <w:t xml:space="preserve">PDF</w:t>
+              <w:t>PDF</w:t>
             </w:r>
           </w:p>
         </w:tc>
@@ -256,7 +256,7 @@
               <w:pStyle w:val="Compact"/>
             </w:pPr>
             <w:r>
-              <w:t xml:space="preserve">Cap. 2</w:t>
+              <w:t>Cap. 2</w:t>
             </w:r>
           </w:p>
         </w:tc>
@@ -269,7 +269,7 @@
               <w:pStyle w:val="Compact"/>
             </w:pPr>
             <w:r>
-              <w:t xml:space="preserve">03</w:t>
+              <w:t>03</w:t>
             </w:r>
           </w:p>
         </w:tc>
@@ -280,7 +280,7 @@
               <w:pStyle w:val="Compact"/>
             </w:pPr>
             <w:r>
-              <w:t xml:space="preserve">Policy AI Interna (pronta in 30 minuti)</w:t>
+              <w:t>Policy AI Interna (pronta in 30 minuti)</w:t>
             </w:r>
           </w:p>
         </w:tc>
@@ -291,7 +291,7 @@
               <w:pStyle w:val="Compact"/>
             </w:pPr>
             <w:r>
-              <w:t xml:space="preserve">PDF · DOCX</w:t>
+              <w:t>PDF · DOCX</w:t>
             </w:r>
           </w:p>
         </w:tc>
@@ -302,7 +302,7 @@
               <w:pStyle w:val="Compact"/>
             </w:pPr>
             <w:r>
-              <w:t xml:space="preserve">Cap. 2</w:t>
+              <w:t>Cap. 2</w:t>
             </w:r>
           </w:p>
         </w:tc>
@@ -315,7 +315,7 @@
               <w:pStyle w:val="Compact"/>
             </w:pPr>
             <w:r>
-              <w:t xml:space="preserve">04</w:t>
+              <w:t>04</w:t>
             </w:r>
           </w:p>
         </w:tc>
@@ -326,7 +326,7 @@
               <w:pStyle w:val="Compact"/>
             </w:pPr>
             <w:r>
-              <w:t xml:space="preserve">Confronto Strumenti AI (12 strumenti)</w:t>
+              <w:t>Confronto Strumenti AI (12 strumenti)</w:t>
             </w:r>
           </w:p>
         </w:tc>
@@ -337,7 +337,7 @@
               <w:pStyle w:val="Compact"/>
             </w:pPr>
             <w:r>
-              <w:t xml:space="preserve">XLSX</w:t>
+              <w:t>XLSX</w:t>
             </w:r>
           </w:p>
         </w:tc>
@@ -348,7 +348,7 @@
               <w:pStyle w:val="Compact"/>
             </w:pPr>
             <w:r>
-              <w:t xml:space="preserve">Cap. 3</w:t>
+              <w:t>Cap. 3</w:t>
             </w:r>
           </w:p>
         </w:tc>
@@ -361,7 +361,7 @@
               <w:pStyle w:val="Compact"/>
             </w:pPr>
             <w:r>
-              <w:t xml:space="preserve">05</w:t>
+              <w:t>05</w:t>
             </w:r>
           </w:p>
         </w:tc>
@@ -372,7 +372,7 @@
               <w:pStyle w:val="Compact"/>
             </w:pPr>
             <w:r>
-              <w:t xml:space="preserve">Quale strumento AI scegliere per primo</w:t>
+              <w:t>Quale strumento AI scegliere per primo</w:t>
             </w:r>
           </w:p>
         </w:tc>
@@ -383,7 +383,7 @@
               <w:pStyle w:val="Compact"/>
             </w:pPr>
             <w:r>
-              <w:t xml:space="preserve">PDF · DOCX</w:t>
+              <w:t>PDF · DOCX</w:t>
             </w:r>
           </w:p>
         </w:tc>
@@ -394,7 +394,7 @@
               <w:pStyle w:val="Compact"/>
             </w:pPr>
             <w:r>
-              <w:t xml:space="preserve">Cap. 3</w:t>
+              <w:t>Cap. 3</w:t>
             </w:r>
           </w:p>
         </w:tc>
@@ -407,7 +407,7 @@
               <w:pStyle w:val="Compact"/>
             </w:pPr>
             <w:r>
-              <w:t xml:space="preserve">06</w:t>
+              <w:t>06</w:t>
             </w:r>
           </w:p>
         </w:tc>
@@ -418,7 +418,7 @@
               <w:pStyle w:val="Compact"/>
             </w:pPr>
             <w:r>
-              <w:t xml:space="preserve">12 Scaffold di prompt + 38 prompt avanzati</w:t>
+              <w:t>12 Scaffold di prompt + 38 prompt avanzati</w:t>
             </w:r>
           </w:p>
         </w:tc>
@@ -429,7 +429,7 @@
               <w:pStyle w:val="Compact"/>
             </w:pPr>
             <w:r>
-              <w:t xml:space="preserve">PDF</w:t>
+              <w:t>PDF</w:t>
             </w:r>
           </w:p>
         </w:tc>
@@ -440,7 +440,7 @@
               <w:pStyle w:val="Compact"/>
             </w:pPr>
             <w:r>
-              <w:t xml:space="preserve">Cap. 4</w:t>
+              <w:t>Cap. 4</w:t>
             </w:r>
           </w:p>
         </w:tc>
@@ -453,7 +453,7 @@
               <w:pStyle w:val="Compact"/>
             </w:pPr>
             <w:r>
-              <w:t xml:space="preserve">07</w:t>
+              <w:t>07</w:t>
             </w:r>
           </w:p>
         </w:tc>
@@ -464,7 +464,7 @@
               <w:pStyle w:val="Compact"/>
             </w:pPr>
             <w:r>
-              <w:t xml:space="preserve">Calendario Editoriale (30 giorni)</w:t>
+              <w:t>Calendario Editoriale (30 giorni)</w:t>
             </w:r>
           </w:p>
         </w:tc>
@@ -475,7 +475,7 @@
               <w:pStyle w:val="Compact"/>
             </w:pPr>
             <w:r>
-              <w:t xml:space="preserve">XLSX</w:t>
+              <w:t>XLSX</w:t>
             </w:r>
           </w:p>
         </w:tc>
@@ -486,7 +486,7 @@
               <w:pStyle w:val="Compact"/>
             </w:pPr>
             <w:r>
-              <w:t xml:space="preserve">Cap. 5</w:t>
+              <w:t>Cap. 5</w:t>
             </w:r>
           </w:p>
         </w:tc>
@@ -499,7 +499,7 @@
               <w:pStyle w:val="Compact"/>
             </w:pPr>
             <w:r>
-              <w:t xml:space="preserve">08</w:t>
+              <w:t>08</w:t>
             </w:r>
           </w:p>
         </w:tc>
@@ -510,7 +510,7 @@
               <w:pStyle w:val="Compact"/>
             </w:pPr>
             <w:r>
-              <w:t xml:space="preserve">Template Newsletter mensile</w:t>
+              <w:t>Template Newsletter mensile</w:t>
             </w:r>
           </w:p>
         </w:tc>
@@ -521,7 +521,7 @@
               <w:pStyle w:val="Compact"/>
             </w:pPr>
             <w:r>
-              <w:t xml:space="preserve">PDF · DOCX</w:t>
+              <w:t>PDF · DOCX</w:t>
             </w:r>
           </w:p>
         </w:tc>
@@ -532,7 +532,7 @@
               <w:pStyle w:val="Compact"/>
             </w:pPr>
             <w:r>
-              <w:t xml:space="preserve">Cap. 5</w:t>
+              <w:t>Cap. 5</w:t>
             </w:r>
           </w:p>
         </w:tc>
@@ -545,7 +545,7 @@
               <w:pStyle w:val="Compact"/>
             </w:pPr>
             <w:r>
-              <w:t xml:space="preserve">09</w:t>
+              <w:t>09</w:t>
             </w:r>
           </w:p>
         </w:tc>
@@ -556,7 +556,7 @@
               <w:pStyle w:val="Compact"/>
             </w:pPr>
             <w:r>
-              <w:t xml:space="preserve">Template Offerta Commerciale (7 sezioni)</w:t>
+              <w:t>Template Offerta Commerciale (7 sezioni)</w:t>
             </w:r>
           </w:p>
         </w:tc>
@@ -567,7 +567,7 @@
               <w:pStyle w:val="Compact"/>
             </w:pPr>
             <w:r>
-              <w:t xml:space="preserve">PDF · DOCX</w:t>
+              <w:t>PDF · DOCX</w:t>
             </w:r>
           </w:p>
         </w:tc>
@@ -578,7 +578,7 @@
               <w:pStyle w:val="Compact"/>
             </w:pPr>
             <w:r>
-              <w:t xml:space="preserve">Cap. 6</w:t>
+              <w:t>Cap. 6</w:t>
             </w:r>
           </w:p>
         </w:tc>
@@ -591,7 +591,7 @@
               <w:pStyle w:val="Compact"/>
             </w:pPr>
             <w:r>
-              <w:t xml:space="preserve">10</w:t>
+              <w:t>10</w:t>
             </w:r>
           </w:p>
         </w:tc>
@@ -602,7 +602,7 @@
               <w:pStyle w:val="Compact"/>
             </w:pPr>
             <w:r>
-              <w:t xml:space="preserve">CRM Minimo + forecast pesato</w:t>
+              <w:t>CRM Minimo + forecast pesato</w:t>
             </w:r>
           </w:p>
         </w:tc>
@@ -613,7 +613,7 @@
               <w:pStyle w:val="Compact"/>
             </w:pPr>
             <w:r>
-              <w:t xml:space="preserve">XLSX</w:t>
+              <w:t>XLSX</w:t>
             </w:r>
           </w:p>
         </w:tc>
@@ -624,7 +624,7 @@
               <w:pStyle w:val="Compact"/>
             </w:pPr>
             <w:r>
-              <w:t xml:space="preserve">Cap. 6</w:t>
+              <w:t>Cap. 6</w:t>
             </w:r>
           </w:p>
         </w:tc>
@@ -637,7 +637,7 @@
               <w:pStyle w:val="Compact"/>
             </w:pPr>
             <w:r>
-              <w:t xml:space="preserve">11</w:t>
+              <w:t>11</w:t>
             </w:r>
           </w:p>
         </w:tc>
@@ -648,7 +648,7 @@
               <w:pStyle w:val="Compact"/>
             </w:pPr>
             <w:r>
-              <w:t xml:space="preserve">Chiusura Mensile + P&amp;L automatico</w:t>
+              <w:t>Preventivi vincenti con NotebookLM</w:t>
             </w:r>
           </w:p>
         </w:tc>
@@ -659,7 +659,7 @@
               <w:pStyle w:val="Compact"/>
             </w:pPr>
             <w:r>
-              <w:t xml:space="preserve">XLSX</w:t>
+              <w:t>DOCX</w:t>
             </w:r>
           </w:p>
         </w:tc>
@@ -670,7 +670,7 @@
               <w:pStyle w:val="Compact"/>
             </w:pPr>
             <w:r>
-              <w:t xml:space="preserve">Cap. 7</w:t>
+              <w:t>Cap. 6</w:t>
             </w:r>
           </w:p>
         </w:tc>
@@ -683,7 +683,7 @@
               <w:pStyle w:val="Compact"/>
             </w:pPr>
             <w:r>
-              <w:t xml:space="preserve">12</w:t>
+              <w:t>12</w:t>
             </w:r>
           </w:p>
         </w:tc>
@@ -694,7 +694,7 @@
               <w:pStyle w:val="Compact"/>
             </w:pPr>
             <w:r>
-              <w:t xml:space="preserve">Sistema Customer Care con l’AI</w:t>
+              <w:t>Chiusura Mensile + P&amp;L automatico</w:t>
             </w:r>
           </w:p>
         </w:tc>
@@ -705,7 +705,7 @@
               <w:pStyle w:val="Compact"/>
             </w:pPr>
             <w:r>
-              <w:t xml:space="preserve">PDF · DOCX</w:t>
+              <w:t>XLSX</w:t>
             </w:r>
           </w:p>
         </w:tc>
@@ -716,7 +716,7 @@
               <w:pStyle w:val="Compact"/>
             </w:pPr>
             <w:r>
-              <w:t xml:space="preserve">Cap. 8</w:t>
+              <w:t>Cap. 7</w:t>
             </w:r>
           </w:p>
         </w:tc>
@@ -729,7 +729,7 @@
               <w:pStyle w:val="Compact"/>
             </w:pPr>
             <w:r>
-              <w:t xml:space="preserve">13</w:t>
+              <w:t>13</w:t>
             </w:r>
           </w:p>
         </w:tc>
@@ -740,7 +740,7 @@
               <w:pStyle w:val="Compact"/>
             </w:pPr>
             <w:r>
-              <w:t xml:space="preserve">Sistema di Formazione Interna con l’AI</w:t>
+              <w:t>Order-to-Cash con l’AI</w:t>
             </w:r>
           </w:p>
         </w:tc>
@@ -751,7 +751,7 @@
               <w:pStyle w:val="Compact"/>
             </w:pPr>
             <w:r>
-              <w:t xml:space="preserve">PDF · DOCX</w:t>
+              <w:t>XLSX</w:t>
             </w:r>
           </w:p>
         </w:tc>
@@ -762,7 +762,7 @@
               <w:pStyle w:val="Compact"/>
             </w:pPr>
             <w:r>
-              <w:t xml:space="preserve">Cap. 9</w:t>
+              <w:t>Cap. 7</w:t>
             </w:r>
           </w:p>
         </w:tc>
@@ -775,7 +775,7 @@
               <w:pStyle w:val="Compact"/>
             </w:pPr>
             <w:r>
-              <w:t xml:space="preserve">14</w:t>
+              <w:t>14</w:t>
             </w:r>
           </w:p>
         </w:tc>
@@ -786,7 +786,7 @@
               <w:pStyle w:val="Compact"/>
             </w:pPr>
             <w:r>
-              <w:t xml:space="preserve">Roadmap Automazioni AI (12 workflow)</w:t>
+              <w:t>Sistema Customer Care con l’AI</w:t>
             </w:r>
           </w:p>
         </w:tc>
@@ -797,7 +797,7 @@
               <w:pStyle w:val="Compact"/>
             </w:pPr>
             <w:r>
-              <w:t xml:space="preserve">PDF</w:t>
+              <w:t>PDF · DOCX</w:t>
             </w:r>
           </w:p>
         </w:tc>
@@ -808,7 +808,7 @@
               <w:pStyle w:val="Compact"/>
             </w:pPr>
             <w:r>
-              <w:t xml:space="preserve">Cap. 10</w:t>
+              <w:t>Cap. 8</w:t>
             </w:r>
           </w:p>
         </w:tc>
@@ -821,7 +821,7 @@
               <w:pStyle w:val="Compact"/>
             </w:pPr>
             <w:r>
-              <w:t xml:space="preserve">15</w:t>
+              <w:t>15</w:t>
             </w:r>
           </w:p>
         </w:tc>
@@ -832,7 +832,7 @@
               <w:pStyle w:val="Compact"/>
             </w:pPr>
             <w:r>
-              <w:t xml:space="preserve">Policy AI Interna (versione estesa)</w:t>
+              <w:t>Sistema di Formazione Interna con l’AI</w:t>
             </w:r>
           </w:p>
         </w:tc>
@@ -843,7 +843,7 @@
               <w:pStyle w:val="Compact"/>
             </w:pPr>
             <w:r>
-              <w:t xml:space="preserve">PDF · DOCX</w:t>
+              <w:t>PDF · DOCX</w:t>
             </w:r>
           </w:p>
         </w:tc>
@@ -854,7 +854,7 @@
               <w:pStyle w:val="Compact"/>
             </w:pPr>
             <w:r>
-              <w:t xml:space="preserve">Cap. 11</w:t>
+              <w:t>Cap. 9</w:t>
             </w:r>
           </w:p>
         </w:tc>
@@ -867,7 +867,7 @@
               <w:pStyle w:val="Compact"/>
             </w:pPr>
             <w:r>
-              <w:t xml:space="preserve">16</w:t>
+              <w:t>16</w:t>
             </w:r>
           </w:p>
         </w:tc>
@@ -878,7 +878,7 @@
               <w:pStyle w:val="Compact"/>
             </w:pPr>
             <w:r>
-              <w:t xml:space="preserve">Roadmap AI 24 Mesi</w:t>
+              <w:t>Roadmap Automazioni AI (12 workflow)</w:t>
             </w:r>
           </w:p>
         </w:tc>
@@ -889,7 +889,7 @@
               <w:pStyle w:val="Compact"/>
             </w:pPr>
             <w:r>
-              <w:t xml:space="preserve">XLSX</w:t>
+              <w:t>PDF</w:t>
             </w:r>
           </w:p>
         </w:tc>
@@ -900,7 +900,7 @@
               <w:pStyle w:val="Compact"/>
             </w:pPr>
             <w:r>
-              <w:t xml:space="preserve">Cap. 12</w:t>
+              <w:t>Cap. 10</w:t>
             </w:r>
           </w:p>
         </w:tc>
@@ -913,7 +913,7 @@
               <w:pStyle w:val="Compact"/>
             </w:pPr>
             <w:r>
-              <w:t xml:space="preserve">17</w:t>
+              <w:t>17</w:t>
             </w:r>
           </w:p>
         </w:tc>
@@ -924,7 +924,7 @@
               <w:pStyle w:val="Compact"/>
             </w:pPr>
             <w:r>
-              <w:t xml:space="preserve">Checklist 30 giorni per partire con l’AI</w:t>
+              <w:t>Policy AI Interna (versione estesa)</w:t>
             </w:r>
           </w:p>
         </w:tc>
@@ -935,7 +935,7 @@
               <w:pStyle w:val="Compact"/>
             </w:pPr>
             <w:r>
-              <w:t xml:space="preserve">PDF</w:t>
+              <w:t>PDF · DOCX</w:t>
             </w:r>
           </w:p>
         </w:tc>
@@ -946,7 +946,7 @@
               <w:pStyle w:val="Compact"/>
             </w:pPr>
             <w:r>
-              <w:t xml:space="preserve">Appendice B</w:t>
+              <w:t>Cap. 11</w:t>
             </w:r>
           </w:p>
         </w:tc>
@@ -959,7 +959,7 @@
               <w:pStyle w:val="Compact"/>
             </w:pPr>
             <w:r>
-              <w:t xml:space="preserve">18</w:t>
+              <w:t>18</w:t>
             </w:r>
           </w:p>
         </w:tc>
@@ -970,7 +970,7 @@
               <w:pStyle w:val="Compact"/>
             </w:pPr>
             <w:r>
-              <w:t xml:space="preserve">Preventivi vincenti con NotebookLM</w:t>
+              <w:t>Roadmap AI 24 Mesi</w:t>
             </w:r>
           </w:p>
         </w:tc>
@@ -981,7 +981,7 @@
               <w:pStyle w:val="Compact"/>
             </w:pPr>
             <w:r>
-              <w:t xml:space="preserve">DOCX</w:t>
+              <w:t>XLSX</w:t>
             </w:r>
           </w:p>
         </w:tc>
@@ -992,7 +992,7 @@
               <w:pStyle w:val="Compact"/>
             </w:pPr>
             <w:r>
-              <w:t xml:space="preserve">Cap. 6</w:t>
+              <w:t>Cap. 12</w:t>
             </w:r>
           </w:p>
         </w:tc>
@@ -1005,7 +1005,7 @@
               <w:pStyle w:val="Compact"/>
             </w:pPr>
             <w:r>
-              <w:t xml:space="preserve">19</w:t>
+              <w:t>19</w:t>
             </w:r>
           </w:p>
         </w:tc>
@@ -1016,7 +1016,7 @@
               <w:pStyle w:val="Compact"/>
             </w:pPr>
             <w:r>
-              <w:t xml:space="preserve">Order-to-Cash con l’AI</w:t>
+              <w:t>Checklist 30 giorni per partire con l’AI</w:t>
             </w:r>
           </w:p>
         </w:tc>
@@ -1027,7 +1027,7 @@
               <w:pStyle w:val="Compact"/>
             </w:pPr>
             <w:r>
-              <w:t xml:space="preserve">XLSX</w:t>
+              <w:t>PDF</w:t>
             </w:r>
           </w:p>
         </w:tc>
@@ -1038,7 +1038,7 @@
               <w:pStyle w:val="Compact"/>
             </w:pPr>
             <w:r>
-              <w:t xml:space="preserve">Cap. 7</w:t>
+              <w:t>Appendice B</w:t>
             </w:r>
           </w:p>
         </w:tc>
@@ -1051,7 +1051,7 @@
               <w:pStyle w:val="Compact"/>
             </w:pPr>
             <w:r>
-              <w:t xml:space="preserve">Bonus</w:t>
+              <w:t>Bonus</w:t>
             </w:r>
           </w:p>
         </w:tc>
@@ -1062,7 +1062,7 @@
               <w:pStyle w:val="Compact"/>
             </w:pPr>
             <w:r>
-              <w:t xml:space="preserve">Script del Video di Benvenuto</w:t>
+              <w:t>Script del Video di Benvenuto</w:t>
             </w:r>
           </w:p>
         </w:tc>
@@ -1073,7 +1073,7 @@
               <w:pStyle w:val="Compact"/>
             </w:pPr>
             <w:r>
-              <w:t xml:space="preserve">PDF</w:t>
+              <w:t>PDF</w:t>
             </w:r>
           </w:p>
         </w:tc>
@@ -1084,7 +1084,7 @@
               <w:pStyle w:val="Compact"/>
             </w:pPr>
             <w:r>
-              <w:t xml:space="preserve">—</w:t>
+              <w:t>—</w:t>
             </w:r>
           </w:p>
         </w:tc>
@@ -1157,13 +1157,13 @@
           <w:b/>
           <w:bCs/>
         </w:rPr>
-        <w:t xml:space="preserve">Segui la Checklist 30 giorni (17)</w:t>
+        <w:t>Segui la Checklist 30 giorni (19)</w:t>
       </w:r>
       <w:r>
         <w:t xml:space="preserve"> </w:t>
       </w:r>
       <w:r>
-        <w:t xml:space="preserve">per costruire l’abitudine, un processo alla volta.</w:t>
+        <w:t>per costruire l’abitudine, un processo alla volta.</w:t>
       </w:r>
     </w:p>
     <w:p>

</xml_diff>